<commit_message>
Agrega tercer enfoque: analisis de riesgos MAGERIT + reconocimiento
- analisis-riesgos/: metodologia MAGERIT (ISO 27005) + matriz de riesgos (xlsx)
- evidencias: reconocimiento con nmap (08) e interceptacion HTTP del ataque (09)
- documento: integra el enfoque complementario de analisis de riesgos (3198 palabras)
- README actualizado con la nueva estructura

Co-Authored-By: Claude Opus 4.8 <noreply@anthropic.com>
</commit_message>
<xml_diff>
--- a/proyecto-tcc/documento/Avance_TCC.docx
+++ b/proyecto-tcc/documento/Avance_TCC.docx
@@ -203,7 +203,7 @@
         <w:pStyle w:val="Ttulo1"/>
         <w:spacing w:before="280" w:after="140"/>
       </w:pPr>
-      <w:bookmarkStart w:id="0" w:name="_Toc243942953"/>
+      <w:bookmarkStart w:id="0" w:name="_Toc243944490"/>
       <w:r>
         <w:rPr>
           <w:b/>
@@ -220,7 +220,7 @@
     <w:sdt>
       <w:sdtPr>
         <w:alias w:val="Tabla de Contenidos"/>
-        <w:id w:val="591128630"/>
+        <w:id w:val="-1031031015"/>
       </w:sdtPr>
       <w:sdtEndPr/>
       <w:sdtContent>
@@ -246,7 +246,7 @@
           <w:r>
             <w:fldChar w:fldCharType="separate"/>
           </w:r>
-          <w:hyperlink w:anchor="_Toc243942953" w:history="1">
+          <w:hyperlink w:anchor="_Toc243944490" w:history="1">
             <w:r>
               <w:rPr>
                 <w:rStyle w:val="Hipervnculo"/>
@@ -272,7 +272,7 @@
               <w:rPr>
                 <w:noProof/>
               </w:rPr>
-              <w:instrText xml:space="preserve"> PAGEREF _Toc243942953 \h </w:instrText>
+              <w:instrText xml:space="preserve"> PAGEREF _Toc243944490 \h </w:instrText>
             </w:r>
             <w:r>
               <w:rPr>
@@ -312,7 +312,7 @@
               <w14:ligatures w14:val="standardContextual"/>
             </w:rPr>
           </w:pPr>
-          <w:hyperlink w:anchor="_Toc243942954" w:history="1">
+          <w:hyperlink w:anchor="_Toc243944491" w:history="1">
             <w:r>
               <w:rPr>
                 <w:rStyle w:val="Hipervnculo"/>
@@ -338,7 +338,7 @@
               <w:rPr>
                 <w:noProof/>
               </w:rPr>
-              <w:instrText xml:space="preserve"> PAGEREF _Toc243942954 \h </w:instrText>
+              <w:instrText xml:space="preserve"> PAGEREF _Toc243944491 \h </w:instrText>
             </w:r>
             <w:r>
               <w:rPr>
@@ -378,7 +378,7 @@
               <w14:ligatures w14:val="standardContextual"/>
             </w:rPr>
           </w:pPr>
-          <w:hyperlink w:anchor="_Toc243942955" w:history="1">
+          <w:hyperlink w:anchor="_Toc243944492" w:history="1">
             <w:r>
               <w:rPr>
                 <w:rStyle w:val="Hipervnculo"/>
@@ -404,7 +404,7 @@
               <w:rPr>
                 <w:noProof/>
               </w:rPr>
-              <w:instrText xml:space="preserve"> PAGEREF _Toc243942955 \h </w:instrText>
+              <w:instrText xml:space="preserve"> PAGEREF _Toc243944492 \h </w:instrText>
             </w:r>
             <w:r>
               <w:rPr>
@@ -444,7 +444,7 @@
               <w14:ligatures w14:val="standardContextual"/>
             </w:rPr>
           </w:pPr>
-          <w:hyperlink w:anchor="_Toc243942956" w:history="1">
+          <w:hyperlink w:anchor="_Toc243944493" w:history="1">
             <w:r>
               <w:rPr>
                 <w:rStyle w:val="Hipervnculo"/>
@@ -470,7 +470,7 @@
               <w:rPr>
                 <w:noProof/>
               </w:rPr>
-              <w:instrText xml:space="preserve"> PAGEREF _Toc243942956 \h </w:instrText>
+              <w:instrText xml:space="preserve"> PAGEREF _Toc243944493 \h </w:instrText>
             </w:r>
             <w:r>
               <w:rPr>
@@ -510,7 +510,7 @@
               <w14:ligatures w14:val="standardContextual"/>
             </w:rPr>
           </w:pPr>
-          <w:hyperlink w:anchor="_Toc243942957" w:history="1">
+          <w:hyperlink w:anchor="_Toc243944494" w:history="1">
             <w:r>
               <w:rPr>
                 <w:rStyle w:val="Hipervnculo"/>
@@ -536,7 +536,7 @@
               <w:rPr>
                 <w:noProof/>
               </w:rPr>
-              <w:instrText xml:space="preserve"> PAGEREF _Toc243942957 \h </w:instrText>
+              <w:instrText xml:space="preserve"> PAGEREF _Toc243944494 \h </w:instrText>
             </w:r>
             <w:r>
               <w:rPr>
@@ -576,7 +576,7 @@
               <w14:ligatures w14:val="standardContextual"/>
             </w:rPr>
           </w:pPr>
-          <w:hyperlink w:anchor="_Toc243942958" w:history="1">
+          <w:hyperlink w:anchor="_Toc243944495" w:history="1">
             <w:r>
               <w:rPr>
                 <w:rStyle w:val="Hipervnculo"/>
@@ -602,7 +602,7 @@
               <w:rPr>
                 <w:noProof/>
               </w:rPr>
-              <w:instrText xml:space="preserve"> PAGEREF _Toc243942958 \h </w:instrText>
+              <w:instrText xml:space="preserve"> PAGEREF _Toc243944495 \h </w:instrText>
             </w:r>
             <w:r>
               <w:rPr>
@@ -642,7 +642,7 @@
               <w14:ligatures w14:val="standardContextual"/>
             </w:rPr>
           </w:pPr>
-          <w:hyperlink w:anchor="_Toc243942959" w:history="1">
+          <w:hyperlink w:anchor="_Toc243944496" w:history="1">
             <w:r>
               <w:rPr>
                 <w:rStyle w:val="Hipervnculo"/>
@@ -668,7 +668,7 @@
               <w:rPr>
                 <w:noProof/>
               </w:rPr>
-              <w:instrText xml:space="preserve"> PAGEREF _Toc243942959 \h </w:instrText>
+              <w:instrText xml:space="preserve"> PAGEREF _Toc243944496 \h </w:instrText>
             </w:r>
             <w:r>
               <w:rPr>
@@ -708,7 +708,7 @@
               <w14:ligatures w14:val="standardContextual"/>
             </w:rPr>
           </w:pPr>
-          <w:hyperlink w:anchor="_Toc243942960" w:history="1">
+          <w:hyperlink w:anchor="_Toc243944497" w:history="1">
             <w:r>
               <w:rPr>
                 <w:rStyle w:val="Hipervnculo"/>
@@ -734,7 +734,7 @@
               <w:rPr>
                 <w:noProof/>
               </w:rPr>
-              <w:instrText xml:space="preserve"> PAGEREF _Toc243942960 \h </w:instrText>
+              <w:instrText xml:space="preserve"> PAGEREF _Toc243944497 \h </w:instrText>
             </w:r>
             <w:r>
               <w:rPr>
@@ -774,7 +774,7 @@
               <w14:ligatures w14:val="standardContextual"/>
             </w:rPr>
           </w:pPr>
-          <w:hyperlink w:anchor="_Toc243942961" w:history="1">
+          <w:hyperlink w:anchor="_Toc243944498" w:history="1">
             <w:r>
               <w:rPr>
                 <w:rStyle w:val="Hipervnculo"/>
@@ -800,7 +800,7 @@
               <w:rPr>
                 <w:noProof/>
               </w:rPr>
-              <w:instrText xml:space="preserve"> PAGEREF _Toc243942961 \h </w:instrText>
+              <w:instrText xml:space="preserve"> PAGEREF _Toc243944498 \h </w:instrText>
             </w:r>
             <w:r>
               <w:rPr>
@@ -840,7 +840,7 @@
               <w14:ligatures w14:val="standardContextual"/>
             </w:rPr>
           </w:pPr>
-          <w:hyperlink w:anchor="_Toc243942962" w:history="1">
+          <w:hyperlink w:anchor="_Toc243944499" w:history="1">
             <w:r>
               <w:rPr>
                 <w:rStyle w:val="Hipervnculo"/>
@@ -866,7 +866,7 @@
               <w:rPr>
                 <w:noProof/>
               </w:rPr>
-              <w:instrText xml:space="preserve"> PAGEREF _Toc243942962 \h </w:instrText>
+              <w:instrText xml:space="preserve"> PAGEREF _Toc243944499 \h </w:instrText>
             </w:r>
             <w:r>
               <w:rPr>
@@ -906,7 +906,7 @@
               <w14:ligatures w14:val="standardContextual"/>
             </w:rPr>
           </w:pPr>
-          <w:hyperlink w:anchor="_Toc243942963" w:history="1">
+          <w:hyperlink w:anchor="_Toc243944500" w:history="1">
             <w:r>
               <w:rPr>
                 <w:rStyle w:val="Hipervnculo"/>
@@ -932,7 +932,7 @@
               <w:rPr>
                 <w:noProof/>
               </w:rPr>
-              <w:instrText xml:space="preserve"> PAGEREF _Toc243942963 \h </w:instrText>
+              <w:instrText xml:space="preserve"> PAGEREF _Toc243944500 \h </w:instrText>
             </w:r>
             <w:r>
               <w:rPr>
@@ -972,7 +972,7 @@
               <w14:ligatures w14:val="standardContextual"/>
             </w:rPr>
           </w:pPr>
-          <w:hyperlink w:anchor="_Toc243942964" w:history="1">
+          <w:hyperlink w:anchor="_Toc243944501" w:history="1">
             <w:r>
               <w:rPr>
                 <w:rStyle w:val="Hipervnculo"/>
@@ -998,7 +998,7 @@
               <w:rPr>
                 <w:noProof/>
               </w:rPr>
-              <w:instrText xml:space="preserve"> PAGEREF _Toc243942964 \h </w:instrText>
+              <w:instrText xml:space="preserve"> PAGEREF _Toc243944501 \h </w:instrText>
             </w:r>
             <w:r>
               <w:rPr>
@@ -1038,7 +1038,7 @@
               <w14:ligatures w14:val="standardContextual"/>
             </w:rPr>
           </w:pPr>
-          <w:hyperlink w:anchor="_Toc243942965" w:history="1">
+          <w:hyperlink w:anchor="_Toc243944502" w:history="1">
             <w:r>
               <w:rPr>
                 <w:rStyle w:val="Hipervnculo"/>
@@ -1046,6 +1046,72 @@
                 <w:bCs/>
                 <w:noProof/>
               </w:rPr>
+              <w:t>Enfoque complementario — Análisis de riesgos (MAGERIT)</w:t>
+            </w:r>
+            <w:r>
+              <w:rPr>
+                <w:noProof/>
+              </w:rPr>
+              <w:tab/>
+            </w:r>
+            <w:r>
+              <w:rPr>
+                <w:noProof/>
+              </w:rPr>
+              <w:fldChar w:fldCharType="begin"/>
+            </w:r>
+            <w:r>
+              <w:rPr>
+                <w:noProof/>
+              </w:rPr>
+              <w:instrText xml:space="preserve"> PAGEREF _Toc243944502 \h </w:instrText>
+            </w:r>
+            <w:r>
+              <w:rPr>
+                <w:noProof/>
+              </w:rPr>
+            </w:r>
+            <w:r>
+              <w:rPr>
+                <w:noProof/>
+              </w:rPr>
+              <w:fldChar w:fldCharType="separate"/>
+            </w:r>
+            <w:r>
+              <w:rPr>
+                <w:noProof/>
+              </w:rPr>
+              <w:t>8</w:t>
+            </w:r>
+            <w:r>
+              <w:rPr>
+                <w:noProof/>
+              </w:rPr>
+              <w:fldChar w:fldCharType="end"/>
+            </w:r>
+          </w:hyperlink>
+        </w:p>
+        <w:p>
+          <w:pPr>
+            <w:pStyle w:val="TDC2"/>
+            <w:tabs>
+              <w:tab w:val="right" w:leader="dot" w:pos="9350"/>
+            </w:tabs>
+            <w:rPr>
+              <w:rFonts w:asciiTheme="minorHAnsi" w:eastAsiaTheme="minorEastAsia" w:hAnsiTheme="minorHAnsi" w:cstheme="minorBidi"/>
+              <w:noProof/>
+              <w:kern w:val="2"/>
+              <w14:ligatures w14:val="standardContextual"/>
+            </w:rPr>
+          </w:pPr>
+          <w:hyperlink w:anchor="_Toc243944503" w:history="1">
+            <w:r>
+              <w:rPr>
+                <w:rStyle w:val="Hipervnculo"/>
+                <w:b/>
+                <w:bCs/>
+                <w:noProof/>
+              </w:rPr>
               <w:t>Tabla de controles (amenaza → contramedida)</w:t>
             </w:r>
             <w:r>
@@ -1064,7 +1130,7 @@
               <w:rPr>
                 <w:noProof/>
               </w:rPr>
-              <w:instrText xml:space="preserve"> PAGEREF _Toc243942965 \h </w:instrText>
+              <w:instrText xml:space="preserve"> PAGEREF _Toc243944503 \h </w:instrText>
             </w:r>
             <w:r>
               <w:rPr>
@@ -1104,7 +1170,7 @@
               <w14:ligatures w14:val="standardContextual"/>
             </w:rPr>
           </w:pPr>
-          <w:hyperlink w:anchor="_Toc243942966" w:history="1">
+          <w:hyperlink w:anchor="_Toc243944504" w:history="1">
             <w:r>
               <w:rPr>
                 <w:rStyle w:val="Hipervnculo"/>
@@ -1130,7 +1196,7 @@
               <w:rPr>
                 <w:noProof/>
               </w:rPr>
-              <w:instrText xml:space="preserve"> PAGEREF _Toc243942966 \h </w:instrText>
+              <w:instrText xml:space="preserve"> PAGEREF _Toc243944504 \h </w:instrText>
             </w:r>
             <w:r>
               <w:rPr>
@@ -1147,7 +1213,7 @@
               <w:rPr>
                 <w:noProof/>
               </w:rPr>
-              <w:t>8</w:t>
+              <w:t>9</w:t>
             </w:r>
             <w:r>
               <w:rPr>
@@ -1170,7 +1236,7 @@
               <w14:ligatures w14:val="standardContextual"/>
             </w:rPr>
           </w:pPr>
-          <w:hyperlink w:anchor="_Toc243942967" w:history="1">
+          <w:hyperlink w:anchor="_Toc243944505" w:history="1">
             <w:r>
               <w:rPr>
                 <w:rStyle w:val="Hipervnculo"/>
@@ -1196,7 +1262,7 @@
               <w:rPr>
                 <w:noProof/>
               </w:rPr>
-              <w:instrText xml:space="preserve"> PAGEREF _Toc243942967 \h </w:instrText>
+              <w:instrText xml:space="preserve"> PAGEREF _Toc243944505 \h </w:instrText>
             </w:r>
             <w:r>
               <w:rPr>
@@ -1236,7 +1302,7 @@
               <w14:ligatures w14:val="standardContextual"/>
             </w:rPr>
           </w:pPr>
-          <w:hyperlink w:anchor="_Toc243942968" w:history="1">
+          <w:hyperlink w:anchor="_Toc243944506" w:history="1">
             <w:r>
               <w:rPr>
                 <w:rStyle w:val="Hipervnculo"/>
@@ -1262,7 +1328,7 @@
               <w:rPr>
                 <w:noProof/>
               </w:rPr>
-              <w:instrText xml:space="preserve"> PAGEREF _Toc243942968 \h </w:instrText>
+              <w:instrText xml:space="preserve"> PAGEREF _Toc243944506 \h </w:instrText>
             </w:r>
             <w:r>
               <w:rPr>
@@ -1279,7 +1345,7 @@
               <w:rPr>
                 <w:noProof/>
               </w:rPr>
-              <w:t>11</w:t>
+              <w:t>12</w:t>
             </w:r>
             <w:r>
               <w:rPr>
@@ -1302,7 +1368,7 @@
               <w14:ligatures w14:val="standardContextual"/>
             </w:rPr>
           </w:pPr>
-          <w:hyperlink w:anchor="_Toc243942969" w:history="1">
+          <w:hyperlink w:anchor="_Toc243944507" w:history="1">
             <w:r>
               <w:rPr>
                 <w:rStyle w:val="Hipervnculo"/>
@@ -1328,7 +1394,7 @@
               <w:rPr>
                 <w:noProof/>
               </w:rPr>
-              <w:instrText xml:space="preserve"> PAGEREF _Toc243942969 \h </w:instrText>
+              <w:instrText xml:space="preserve"> PAGEREF _Toc243944507 \h </w:instrText>
             </w:r>
             <w:r>
               <w:rPr>
@@ -1345,7 +1411,7 @@
               <w:rPr>
                 <w:noProof/>
               </w:rPr>
-              <w:t>12</w:t>
+              <w:t>13</w:t>
             </w:r>
             <w:r>
               <w:rPr>
@@ -1372,7 +1438,7 @@
         <w:pStyle w:val="Ttulo1"/>
         <w:spacing w:before="280" w:after="140"/>
       </w:pPr>
-      <w:bookmarkStart w:id="1" w:name="_Toc243942954"/>
+      <w:bookmarkStart w:id="1" w:name="_Toc243944491"/>
       <w:r>
         <w:rPr>
           <w:b/>
@@ -1484,7 +1550,7 @@
         <w:pStyle w:val="Ttulo1"/>
         <w:spacing w:before="280" w:after="140"/>
       </w:pPr>
-      <w:bookmarkStart w:id="2" w:name="_Toc243942955"/>
+      <w:bookmarkStart w:id="2" w:name="_Toc243944492"/>
       <w:r>
         <w:rPr>
           <w:b/>
@@ -1576,7 +1642,7 @@
         <w:pStyle w:val="Ttulo1"/>
         <w:spacing w:before="280" w:after="140"/>
       </w:pPr>
-      <w:bookmarkStart w:id="3" w:name="_Toc243942956"/>
+      <w:bookmarkStart w:id="3" w:name="_Toc243944493"/>
       <w:r>
         <w:rPr>
           <w:b/>
@@ -1594,7 +1660,7 @@
         <w:pStyle w:val="Ttulo2"/>
         <w:spacing w:before="200" w:after="100"/>
       </w:pPr>
-      <w:bookmarkStart w:id="4" w:name="_Toc243942957"/>
+      <w:bookmarkStart w:id="4" w:name="_Toc243944494"/>
       <w:r>
         <w:rPr>
           <w:b/>
@@ -1619,7 +1685,7 @@
         <w:pStyle w:val="Ttulo2"/>
         <w:spacing w:before="200" w:after="100"/>
       </w:pPr>
-      <w:bookmarkStart w:id="5" w:name="_Toc243942958"/>
+      <w:bookmarkStart w:id="5" w:name="_Toc243944495"/>
       <w:r>
         <w:rPr>
           <w:b/>
@@ -1706,7 +1772,7 @@
         <w:pStyle w:val="Ttulo1"/>
         <w:spacing w:before="280" w:after="140"/>
       </w:pPr>
-      <w:bookmarkStart w:id="6" w:name="_Toc243942959"/>
+      <w:bookmarkStart w:id="6" w:name="_Toc243944496"/>
       <w:r>
         <w:rPr>
           <w:b/>
@@ -1751,7 +1817,7 @@
         <w:pStyle w:val="Ttulo1"/>
         <w:spacing w:before="280" w:after="140"/>
       </w:pPr>
-      <w:bookmarkStart w:id="7" w:name="_Toc243942960"/>
+      <w:bookmarkStart w:id="7" w:name="_Toc243944497"/>
       <w:r>
         <w:rPr>
           <w:b/>
@@ -1779,7 +1845,7 @@
         <w:pStyle w:val="Ttulo2"/>
         <w:spacing w:before="200" w:after="100"/>
       </w:pPr>
-      <w:bookmarkStart w:id="8" w:name="_Toc243942961"/>
+      <w:bookmarkStart w:id="8" w:name="_Toc243944498"/>
       <w:r>
         <w:rPr>
           <w:b/>
@@ -1949,7 +2015,7 @@
         <w:pStyle w:val="Ttulo2"/>
         <w:spacing w:before="200" w:after="100"/>
       </w:pPr>
-      <w:bookmarkStart w:id="9" w:name="_Toc243942962"/>
+      <w:bookmarkStart w:id="9" w:name="_Toc243944499"/>
       <w:r>
         <w:rPr>
           <w:b/>
@@ -2008,7 +2074,7 @@
         <w:pStyle w:val="Ttulo2"/>
         <w:spacing w:before="200" w:after="100"/>
       </w:pPr>
-      <w:bookmarkStart w:id="10" w:name="_Toc243942963"/>
+      <w:bookmarkStart w:id="10" w:name="_Toc243944500"/>
       <w:r>
         <w:rPr>
           <w:b/>
@@ -2046,10 +2112,10 @@
         <w:t>XSS</w:t>
       </w:r>
       <w:r>
-        <w:t>, se inyecta un script que muestra una alerta o lee las cookies de sesión; la causa es la falta de sanitización de la salida, y la contramedida es la codificación HTML, la cabecera Content-Security-Pol</w:t>
-      </w:r>
-      <w:r>
-        <w:t xml:space="preserve">icy y el atributo HttpOnly en las cookies. En </w:t>
+        <w:t>, se inyecta un script que muestra una alerta o lee las cookies de sesión; la causa es la falta de sanitización de la salida, y la contramedida es la codificación HTML, la cabecera Content-Security-Policy y el atri</w:t>
+      </w:r>
+      <w:r>
+        <w:t xml:space="preserve">buto HttpOnly en las cookies. En </w:t>
       </w:r>
       <w:r>
         <w:rPr>
@@ -2071,7 +2137,7 @@
         <w:pStyle w:val="Ttulo2"/>
         <w:spacing w:before="200" w:after="100"/>
       </w:pPr>
-      <w:bookmarkStart w:id="11" w:name="_Toc243942964"/>
+      <w:bookmarkStart w:id="11" w:name="_Toc243944501"/>
       <w:r>
         <w:rPr>
           <w:b/>
@@ -2107,16 +2173,55 @@
         <w:pStyle w:val="Ttulo2"/>
         <w:spacing w:before="200" w:after="100"/>
       </w:pPr>
-      <w:bookmarkStart w:id="12" w:name="_Toc243942965"/>
+      <w:bookmarkStart w:id="12" w:name="_Toc243944502"/>
       <w:r>
         <w:rPr>
           <w:b/>
           <w:bCs/>
           <w:color w:val="000000"/>
         </w:rPr>
+        <w:t>Enfoque complementario — Análisis de riesgos (MAGERIT)</w:t>
+      </w:r>
+      <w:bookmarkEnd w:id="12"/>
+    </w:p>
+    <w:p>
+      <w:pPr>
+        <w:spacing w:after="120"/>
+        <w:ind w:firstLine="480"/>
+        <w:jc w:val="both"/>
+      </w:pPr>
+      <w:r>
+        <w:t xml:space="preserve">Como refuerzo de los dos enfoques principales, el proyecto incorpora un análisis de riesgos formal siguiendo la metodología </w:t>
+      </w:r>
+      <w:r>
+        <w:rPr>
+          <w:b/>
+          <w:bCs/>
+        </w:rPr>
+        <w:t>MAGERIT</w:t>
+      </w:r>
+      <w:r>
+        <w:t xml:space="preserve"> (alineada con la norma ISO 27005). Se elaboró un inventario de activos (base de datos de usuarios, credenciales, aplicación web, sesiones, servidor y datos personales de los clientes), se identificaron las amenazas y vulnerabilidades por activo, y se valoró cada riesgo como el producto de su probabilidad por su impacto, clasificándolo en nivel alto, medio o bajo. El resultado muestra que los riesgos de mayor nivel —inyección SQL, XSS, fuerza bruta, credenciales sin cifrar y fuga de datos personales—</w:t>
+      </w:r>
+      <w:r>
+        <w:t xml:space="preserve"> coinciden con las vulnerabilidades que el proyecto demuestra y mitiga, y que tras aplicar los controles el riesgo residual de cada uno desciende a nivel bajo. El análisis completo y la matriz de riesgos cuantitativa se incluyen como material del proyecto (carpeta analisis-riesgos).</w:t>
+      </w:r>
+    </w:p>
+    <w:p>
+      <w:pPr>
+        <w:pStyle w:val="Ttulo2"/>
+        <w:spacing w:before="200" w:after="100"/>
+      </w:pPr>
+      <w:bookmarkStart w:id="13" w:name="_Toc243944503"/>
+      <w:r>
+        <w:rPr>
+          <w:b/>
+          <w:bCs/>
+          <w:color w:val="000000"/>
+        </w:rPr>
         <w:t>Tabla de controles (amenaza → contramedida)</w:t>
       </w:r>
-      <w:bookmarkEnd w:id="12"/>
+      <w:bookmarkEnd w:id="13"/>
     </w:p>
     <w:p>
       <w:pPr>
@@ -2369,6 +2474,7 @@
                 <w:sz w:val="22"/>
                 <w:szCs w:val="22"/>
               </w:rPr>
+              <w:lastRenderedPageBreak/>
               <w:t>Cross-Site Scripting (XSS) reflejado y almacenado</w:t>
             </w:r>
           </w:p>
@@ -2637,7 +2743,7 @@
         <w:pStyle w:val="Ttulo1"/>
         <w:spacing w:before="280" w:after="140"/>
       </w:pPr>
-      <w:bookmarkStart w:id="13" w:name="_Toc243942966"/>
+      <w:bookmarkStart w:id="14" w:name="_Toc243944504"/>
       <w:r>
         <w:rPr>
           <w:b/>
@@ -2648,7 +2754,7 @@
         </w:rPr>
         <w:t>Resultados o discusión</w:t>
       </w:r>
-      <w:bookmarkEnd w:id="13"/>
+      <w:bookmarkEnd w:id="14"/>
     </w:p>
     <w:p>
       <w:pPr>
@@ -2674,7 +2780,6 @@
         <w:jc w:val="both"/>
       </w:pPr>
       <w:r>
-        <w:lastRenderedPageBreak/>
         <w:t>A la fecha se ha completado el diseño del proyecto (arquitectura segura, flujo de datos con análisis STRIDE y tabla de controles), se ha montado el laboratorio aislado con Docker —con los contenedores de Kali y DVWA operativos y comunicados por la red privada— y se han ejecutado las primeras pruebas técnicas de dos enfoques.</w:t>
       </w:r>
     </w:p>
@@ -2695,10 +2800,10 @@
         <w:t>criptografía</w:t>
       </w:r>
       <w:r>
-        <w:t>, se ejecutó un script que contrasta el almacenamiento de contraseñas en texto plano frente al hash con sal. El resultado confirma la hipótesis: con las contraseñas en texto plano, las credenciales débiles presentes en un diccionario se recuperan de forma instantánea, mientras que con hash y sal cada intento obliga a recomputar el hash por cada cuenta y las contraseñas robustas no se recuperan con el diccionario de prueba. Se observó, además, que DVWA almacena sus contraseñas como MD5 sin sal, un esquema dé</w:t>
-      </w:r>
-      <w:r>
-        <w:t>bil que ilustra precisamente el problema que la mitigación corrige.</w:t>
+        <w:t>, se ejecutó un script que contrasta el almacenamiento de contraseñas en texto plano frente al hash con sal. El resultado confirma la hipótesis: con las contraseñas en texto plano, las credenciales débiles presentes en un diccionario se recuperan de forma instantánea, mientras que con hash y sal cada intento obliga a recomputar el hash por cada cuenta y las contraseñas robustas no se recuperan con el diccionario de prueba. Se observó, además, que DVWA almacena sus contraseñas como MD5 sin sal, u</w:t>
+      </w:r>
+      <w:r>
+        <w:t>n esquema débil que ilustra precisamente el problema que la mitigación corrige.</w:t>
       </w:r>
     </w:p>
     <w:p>
@@ -2739,7 +2844,11 @@
         <w:t>Inyección SQL:</w:t>
       </w:r>
       <w:r>
-        <w:t xml:space="preserve"> la entrada 1' OR '1'='1 evadió la lógica de la consulta y devolvió los cinco usuarios; una consulta UNION exfiltró los nombres de usuario y sus hashes de contraseña. Tras aplicar consultas parametrizadas (nivel seguro), el mismo payload devolvió cero registros.</w:t>
+        <w:t xml:space="preserve"> la entrada 1' OR '1'='1 evadió la lógica de la consulta y devolvió los cinco usuarios; una consulta UNION exfiltró los nombres de usuario y sus hashes de contraseña. </w:t>
+      </w:r>
+      <w:r>
+        <w:lastRenderedPageBreak/>
+        <w:t>Tras aplicar consultas parametrizadas (nivel seguro), el mismo payload devolvió cero registros.</w:t>
       </w:r>
     </w:p>
     <w:p>
@@ -2799,17 +2908,16 @@
         <w:pStyle w:val="Ttulo2"/>
         <w:spacing w:before="200" w:after="100"/>
       </w:pPr>
-      <w:bookmarkStart w:id="14" w:name="_Toc243942967"/>
+      <w:bookmarkStart w:id="15" w:name="_Toc243944505"/>
       <w:r>
         <w:rPr>
           <w:b/>
           <w:bCs/>
           <w:color w:val="000000"/>
         </w:rPr>
-        <w:lastRenderedPageBreak/>
         <w:t>Evidencias de laboratorio</w:t>
       </w:r>
-      <w:bookmarkEnd w:id="14"/>
+      <w:bookmarkEnd w:id="15"/>
     </w:p>
     <w:p>
       <w:pPr>
@@ -2830,7 +2938,7 @@
           <w:noProof/>
         </w:rPr>
         <w:drawing>
-          <wp:inline distT="0" distB="0" distL="0" distR="0" wp14:anchorId="341C3F59" wp14:editId="3AB708C2">
+          <wp:inline distT="0" distB="0" distL="0" distR="0" wp14:anchorId="501FF8BC" wp14:editId="75961FDB">
             <wp:extent cx="5715000" cy="819150"/>
             <wp:effectExtent l="0" t="0" r="0" b="0"/>
             <wp:docPr id="1" name="Imagen 1"/>
@@ -2894,8 +3002,9 @@
         <w:rPr>
           <w:noProof/>
         </w:rPr>
+        <w:lastRenderedPageBreak/>
         <w:drawing>
-          <wp:inline distT="0" distB="0" distL="0" distR="0" wp14:anchorId="1AD7C2A3" wp14:editId="6252979E">
+          <wp:inline distT="0" distB="0" distL="0" distR="0" wp14:anchorId="1B51136A" wp14:editId="106290EB">
             <wp:extent cx="3143250" cy="2981325"/>
             <wp:effectExtent l="0" t="0" r="0" b="0"/>
             <wp:docPr id="2" name="Imagen 2"/>
@@ -2959,9 +3068,8 @@
         <w:rPr>
           <w:noProof/>
         </w:rPr>
-        <w:lastRenderedPageBreak/>
         <w:drawing>
-          <wp:inline distT="0" distB="0" distL="0" distR="0" wp14:anchorId="158F6F47" wp14:editId="3AACB954">
+          <wp:inline distT="0" distB="0" distL="0" distR="0" wp14:anchorId="305E3ED2" wp14:editId="2A9CC1A7">
             <wp:extent cx="4095750" cy="3409950"/>
             <wp:effectExtent l="0" t="0" r="0" b="0"/>
             <wp:docPr id="3" name="Imagen 3"/>
@@ -3025,8 +3133,9 @@
         <w:rPr>
           <w:noProof/>
         </w:rPr>
+        <w:lastRenderedPageBreak/>
         <w:drawing>
-          <wp:inline distT="0" distB="0" distL="0" distR="0" wp14:anchorId="0F4EB0BF" wp14:editId="58DF5212">
+          <wp:inline distT="0" distB="0" distL="0" distR="0" wp14:anchorId="5ABDE275" wp14:editId="41A58496">
             <wp:extent cx="3810000" cy="2819400"/>
             <wp:effectExtent l="0" t="0" r="0" b="0"/>
             <wp:docPr id="4" name="Imagen 4"/>
@@ -3086,7 +3195,7 @@
         <w:pStyle w:val="Ttulo2"/>
         <w:spacing w:before="200" w:after="100"/>
       </w:pPr>
-      <w:bookmarkStart w:id="15" w:name="_Toc243942968"/>
+      <w:bookmarkStart w:id="16" w:name="_Toc243944506"/>
       <w:r>
         <w:rPr>
           <w:b/>
@@ -3095,7 +3204,7 @@
         </w:rPr>
         <w:t>Conclusiones y recomendaciones</w:t>
       </w:r>
-      <w:bookmarkEnd w:id="15"/>
+      <w:bookmarkEnd w:id="16"/>
     </w:p>
     <w:p>
       <w:pPr>
@@ -3104,11 +3213,10 @@
         <w:jc w:val="both"/>
       </w:pPr>
       <w:r>
-        <w:t xml:space="preserve">El trabajo demuestra que las tres vulnerabilidades más frecuentes en aplicaciones web de pequeñas empresas no solo son fáciles de explotar cuando no existen controles, sino también sencillas de cerrar cuando se aplican las contramedidas adecuadas. En el laboratorio, un atacante </w:t>
-      </w:r>
-      <w:r>
-        <w:lastRenderedPageBreak/>
-        <w:t>sin privilegios logró extraer toda la base de usuarios mediante inyección SQL, ejecutar código en el navegador mediante XSS y adivinar una contraseña débil por fuerza bruta; tras aplicar consultas parametrizadas, codificación de salida y control de intentos, los mismos ataques dejaron de funcionar.</w:t>
+        <w:t>El trabajo demuestra que las tres vulnerabilidades más frecuentes en aplicaciones web de pequeñas empresas no solo son fáciles de explotar cuando no existen controles, sino también sencillas de cerrar cuando se aplican las contramedidas adecuadas. En el laboratorio, un atacante sin privilegios logró extraer toda la base de usuarios mediante inyección SQL, ejecutar código en el navegador mediante XSS y adivinar una contraseña débil por fuerza bruta; tras aplicar consultas parametrizadas, codificación de sali</w:t>
+      </w:r>
+      <w:r>
+        <w:t>da y control de intentos, los mismos ataques dejaron de funcionar.</w:t>
       </w:r>
     </w:p>
     <w:p>
@@ -3128,10 +3236,11 @@
         <w:jc w:val="both"/>
       </w:pPr>
       <w:r>
-        <w:t>Como recomendaciones para una organización como la del caso, se proponen: adoptar un ciclo de desarrollo que contemple la seguridad desde el diseño; validar y sanear toda entrada del usuario; utilizar siempre consultas parametrizadas; cifrar las credenciales con algoritmos modernos de hash con sal; aplicar cabeceras de seguridad y políticas de contraseñas robustas; y realizar auditorías periódicas apoyadas en referencias como el OWASP Top 10. Estas medidas, de bajo costo relativo, elevan de forma notable el</w:t>
-      </w:r>
-      <w:r>
-        <w:t xml:space="preserve"> nivel de protección y ayudan a cumplir con las obligaciones de la Ley 1581 de 2012.</w:t>
+        <w:t xml:space="preserve">Como recomendaciones para una organización como la del caso, se proponen: adoptar un ciclo de desarrollo que contemple la seguridad desde el diseño; validar y sanear toda entrada del usuario; utilizar siempre consultas parametrizadas; cifrar las credenciales con algoritmos modernos de hash con sal; aplicar cabeceras de seguridad y políticas de contraseñas robustas; y realizar auditorías periódicas apoyadas en referencias como el OWASP Top 10. Estas medidas, de </w:t>
+      </w:r>
+      <w:r>
+        <w:lastRenderedPageBreak/>
+        <w:t>bajo costo relativo, elevan de forma notable el nivel de protección y ayudan a cumplir con las obligaciones de la Ley 1581 de 2012.</w:t>
       </w:r>
     </w:p>
     <w:p>
@@ -3149,7 +3258,7 @@
         <w:pStyle w:val="Ttulo1"/>
         <w:spacing w:before="280" w:after="140"/>
       </w:pPr>
-      <w:bookmarkStart w:id="16" w:name="_Toc243942969"/>
+      <w:bookmarkStart w:id="17" w:name="_Toc243944507"/>
       <w:r>
         <w:rPr>
           <w:b/>
@@ -3160,7 +3269,7 @@
         </w:rPr>
         <w:t>Bibliografía</w:t>
       </w:r>
-      <w:bookmarkEnd w:id="16"/>
+      <w:bookmarkEnd w:id="17"/>
     </w:p>
     <w:p>
       <w:pPr>
@@ -3204,7 +3313,6 @@
         <w:jc w:val="both"/>
       </w:pPr>
       <w:r>
-        <w:lastRenderedPageBreak/>
         <w:t>Stallings, W. (2017). Cryptography and Network Security: Principles and Practice (7.ª ed.). Pearson.</w:t>
       </w:r>
     </w:p>
@@ -3239,96 +3347,10 @@
 <file path=word/numbering.xml><?xml version="1.0" encoding="utf-8"?>
 <w:numbering xmlns:wpc="http://schemas.microsoft.com/office/word/2010/wordprocessingCanvas" xmlns:cx="http://schemas.microsoft.com/office/drawing/2014/chartex" xmlns:cx1="http://schemas.microsoft.com/office/drawing/2015/9/8/chartex" xmlns:cx2="http://schemas.microsoft.com/office/drawing/2015/10/21/chartex" xmlns:cx3="http://schemas.microsoft.com/office/drawing/2016/5/9/chartex" xmlns:cx4="http://schemas.microsoft.com/office/drawing/2016/5/10/chartex" xmlns:cx5="http://schemas.microsoft.com/office/drawing/2016/5/11/chartex" xmlns:cx6="http://schemas.microsoft.com/office/drawing/2016/5/12/chartex" xmlns:cx7="http://schemas.microsoft.com/office/drawing/2016/5/13/chartex" xmlns:cx8="http://schemas.microsoft.com/office/drawing/2016/5/14/chartex" xmlns:mc="http://schemas.openxmlformats.org/markup-compatibility/2006" xmlns:aink="http://schemas.microsoft.com/office/drawing/2016/ink" xmlns:am3d="http://schemas.microsoft.com/office/drawing/2017/model3d" xmlns:o="urn:schemas-microsoft-com:office:office" xmlns:oel="http://schemas.microsoft.com/office/2019/extlst" xmlns:r="http://schemas.openxmlformats.org/officeDocument/2006/relationships" xmlns:m="http://schemas.openxmlformats.org/officeDocument/2006/math" xmlns:v="urn:schemas-microsoft-com:vml" xmlns:wp14="http://schemas.microsoft.com/office/word/2010/wordprocessingDrawing" xmlns:wp="http://schemas.openxmlformats.org/drawingml/2006/wordprocessingDrawing" xmlns:w10="urn:schemas-microsoft-com:office:word" xmlns:w="http://schemas.openxmlformats.org/wordprocessingml/2006/main" xmlns:w14="http://schemas.microsoft.com/office/word/2010/wordml" xmlns:w15="http://schemas.microsoft.com/office/word/2012/wordml" xmlns:w16cex="http://schemas.microsoft.com/office/word/2018/wordml/cex" xmlns:w16cid="http://schemas.microsoft.com/office/word/2016/wordml/cid" xmlns:w16="http://schemas.microsoft.com/office/word/2018/wordml" xmlns:w16sdtdh="http://schemas.microsoft.com/office/word/2020/wordml/sdtdatahash" xmlns:w16se="http://schemas.microsoft.com/office/word/2015/wordml/symex" xmlns:wpg="http://schemas.microsoft.com/office/word/2010/wordprocessingGroup" xmlns:wpi="http://schemas.microsoft.com/office/word/2010/wordprocessingInk" xmlns:wne="http://schemas.microsoft.com/office/word/2006/wordml" xmlns:wps="http://schemas.microsoft.com/office/word/2010/wordprocessingShape" mc:Ignorable="w14 w15 w16se w16cid w16 w16cex w16sdtdh wp14">
   <w:abstractNum w:abstractNumId="0" w15:restartNumberingAfterBreak="0">
-    <w:nsid w:val="2F9A610E"/>
+    <w:nsid w:val="318B5791"/>
     <w:multiLevelType w:val="hybridMultilevel"/>
-    <w:tmpl w:val="260269CA"/>
-    <w:lvl w:ilvl="0" w:tplc="C0D8D75A" w:tentative="1">
-      <w:start w:val="1"/>
-      <w:numFmt w:val="bullet"/>
-      <w:lvlText w:val="●"/>
-      <w:lvlJc w:val="left"/>
-      <w:pPr>
-        <w:ind w:left="720" w:hanging="360"/>
-      </w:pPr>
-    </w:lvl>
-    <w:lvl w:ilvl="1" w:tplc="220C90B2" w:tentative="1">
-      <w:start w:val="1"/>
-      <w:numFmt w:val="bullet"/>
-      <w:lvlText w:val="○"/>
-      <w:lvlJc w:val="left"/>
-      <w:pPr>
-        <w:ind w:left="1440" w:hanging="360"/>
-      </w:pPr>
-    </w:lvl>
-    <w:lvl w:ilvl="2" w:tplc="AA061218" w:tentative="1">
-      <w:start w:val="1"/>
-      <w:numFmt w:val="bullet"/>
-      <w:lvlText w:val="■"/>
-      <w:lvlJc w:val="left"/>
-      <w:pPr>
-        <w:ind w:left="2160" w:hanging="360"/>
-      </w:pPr>
-    </w:lvl>
-    <w:lvl w:ilvl="3" w:tplc="7F7676A4" w:tentative="1">
-      <w:start w:val="1"/>
-      <w:numFmt w:val="bullet"/>
-      <w:lvlText w:val="●"/>
-      <w:lvlJc w:val="left"/>
-      <w:pPr>
-        <w:ind w:left="2880" w:hanging="360"/>
-      </w:pPr>
-    </w:lvl>
-    <w:lvl w:ilvl="4" w:tplc="CC243162" w:tentative="1">
-      <w:start w:val="1"/>
-      <w:numFmt w:val="bullet"/>
-      <w:lvlText w:val="○"/>
-      <w:lvlJc w:val="left"/>
-      <w:pPr>
-        <w:ind w:left="3600" w:hanging="360"/>
-      </w:pPr>
-    </w:lvl>
-    <w:lvl w:ilvl="5" w:tplc="DA7C7F80" w:tentative="1">
-      <w:start w:val="1"/>
-      <w:numFmt w:val="bullet"/>
-      <w:lvlText w:val="■"/>
-      <w:lvlJc w:val="left"/>
-      <w:pPr>
-        <w:ind w:left="4320" w:hanging="360"/>
-      </w:pPr>
-    </w:lvl>
-    <w:lvl w:ilvl="6" w:tplc="B0D2FAC0" w:tentative="1">
-      <w:start w:val="1"/>
-      <w:numFmt w:val="bullet"/>
-      <w:lvlText w:val="●"/>
-      <w:lvlJc w:val="left"/>
-      <w:pPr>
-        <w:ind w:left="5040" w:hanging="360"/>
-      </w:pPr>
-    </w:lvl>
-    <w:lvl w:ilvl="7" w:tplc="3BDA670E" w:tentative="1">
-      <w:start w:val="1"/>
-      <w:numFmt w:val="bullet"/>
-      <w:lvlText w:val="●"/>
-      <w:lvlJc w:val="left"/>
-      <w:pPr>
-        <w:ind w:left="5760" w:hanging="360"/>
-      </w:pPr>
-    </w:lvl>
-    <w:lvl w:ilvl="8" w:tplc="0D96893A" w:tentative="1">
-      <w:start w:val="1"/>
-      <w:numFmt w:val="bullet"/>
-      <w:lvlText w:val="●"/>
-      <w:lvlJc w:val="left"/>
-      <w:pPr>
-        <w:ind w:left="6480" w:hanging="360"/>
-      </w:pPr>
-    </w:lvl>
-  </w:abstractNum>
-  <w:abstractNum w:abstractNumId="1" w15:restartNumberingAfterBreak="0">
-    <w:nsid w:val="43071862"/>
-    <w:multiLevelType w:val="hybridMultilevel"/>
-    <w:tmpl w:val="1A1AA0A4"/>
-    <w:lvl w:ilvl="0" w:tplc="29A4E5A2">
+    <w:tmpl w:val="4BCE8E4C"/>
+    <w:lvl w:ilvl="0" w:tplc="8BD29564">
       <w:start w:val="1"/>
       <w:numFmt w:val="bullet"/>
       <w:lvlText w:val="•"/>
@@ -3337,55 +3359,141 @@
         <w:ind w:left="720" w:hanging="360"/>
       </w:pPr>
     </w:lvl>
-    <w:lvl w:ilvl="1" w:tplc="2CC27CE6">
+    <w:lvl w:ilvl="1" w:tplc="BFDC021A">
       <w:numFmt w:val="decimal"/>
       <w:lvlText w:val=""/>
       <w:lvlJc w:val="left"/>
     </w:lvl>
-    <w:lvl w:ilvl="2" w:tplc="2A22C0F6">
+    <w:lvl w:ilvl="2" w:tplc="F0C8CD86">
       <w:numFmt w:val="decimal"/>
       <w:lvlText w:val=""/>
       <w:lvlJc w:val="left"/>
     </w:lvl>
-    <w:lvl w:ilvl="3" w:tplc="32C06080">
+    <w:lvl w:ilvl="3" w:tplc="31363094">
       <w:numFmt w:val="decimal"/>
       <w:lvlText w:val=""/>
       <w:lvlJc w:val="left"/>
     </w:lvl>
-    <w:lvl w:ilvl="4" w:tplc="78BC521A">
+    <w:lvl w:ilvl="4" w:tplc="0242EFA4">
       <w:numFmt w:val="decimal"/>
       <w:lvlText w:val=""/>
       <w:lvlJc w:val="left"/>
     </w:lvl>
-    <w:lvl w:ilvl="5" w:tplc="07EE83CC">
+    <w:lvl w:ilvl="5" w:tplc="FF10D582">
       <w:numFmt w:val="decimal"/>
       <w:lvlText w:val=""/>
       <w:lvlJc w:val="left"/>
     </w:lvl>
-    <w:lvl w:ilvl="6" w:tplc="B29ED64E">
+    <w:lvl w:ilvl="6" w:tplc="9D4AC552">
       <w:numFmt w:val="decimal"/>
       <w:lvlText w:val=""/>
       <w:lvlJc w:val="left"/>
     </w:lvl>
-    <w:lvl w:ilvl="7" w:tplc="FAAAD7FC">
+    <w:lvl w:ilvl="7" w:tplc="8A101282">
       <w:numFmt w:val="decimal"/>
       <w:lvlText w:val=""/>
       <w:lvlJc w:val="left"/>
     </w:lvl>
-    <w:lvl w:ilvl="8" w:tplc="87009ABA">
+    <w:lvl w:ilvl="8" w:tplc="89C49F0A">
       <w:numFmt w:val="decimal"/>
       <w:lvlText w:val=""/>
       <w:lvlJc w:val="left"/>
     </w:lvl>
   </w:abstractNum>
-  <w:num w:numId="1" w16cid:durableId="913204010">
-    <w:abstractNumId w:val="0"/>
+  <w:abstractNum w:abstractNumId="1" w15:restartNumberingAfterBreak="0">
+    <w:nsid w:val="50854FAD"/>
+    <w:multiLevelType w:val="hybridMultilevel"/>
+    <w:tmpl w:val="C6C4F88E"/>
+    <w:lvl w:ilvl="0" w:tplc="131806AE" w:tentative="1">
+      <w:start w:val="1"/>
+      <w:numFmt w:val="bullet"/>
+      <w:lvlText w:val="●"/>
+      <w:lvlJc w:val="left"/>
+      <w:pPr>
+        <w:ind w:left="720" w:hanging="360"/>
+      </w:pPr>
+    </w:lvl>
+    <w:lvl w:ilvl="1" w:tplc="B0482C14" w:tentative="1">
+      <w:start w:val="1"/>
+      <w:numFmt w:val="bullet"/>
+      <w:lvlText w:val="○"/>
+      <w:lvlJc w:val="left"/>
+      <w:pPr>
+        <w:ind w:left="1440" w:hanging="360"/>
+      </w:pPr>
+    </w:lvl>
+    <w:lvl w:ilvl="2" w:tplc="52AE6CDC" w:tentative="1">
+      <w:start w:val="1"/>
+      <w:numFmt w:val="bullet"/>
+      <w:lvlText w:val="■"/>
+      <w:lvlJc w:val="left"/>
+      <w:pPr>
+        <w:ind w:left="2160" w:hanging="360"/>
+      </w:pPr>
+    </w:lvl>
+    <w:lvl w:ilvl="3" w:tplc="A9A6BA8E" w:tentative="1">
+      <w:start w:val="1"/>
+      <w:numFmt w:val="bullet"/>
+      <w:lvlText w:val="●"/>
+      <w:lvlJc w:val="left"/>
+      <w:pPr>
+        <w:ind w:left="2880" w:hanging="360"/>
+      </w:pPr>
+    </w:lvl>
+    <w:lvl w:ilvl="4" w:tplc="744AB476" w:tentative="1">
+      <w:start w:val="1"/>
+      <w:numFmt w:val="bullet"/>
+      <w:lvlText w:val="○"/>
+      <w:lvlJc w:val="left"/>
+      <w:pPr>
+        <w:ind w:left="3600" w:hanging="360"/>
+      </w:pPr>
+    </w:lvl>
+    <w:lvl w:ilvl="5" w:tplc="88802D6C" w:tentative="1">
+      <w:start w:val="1"/>
+      <w:numFmt w:val="bullet"/>
+      <w:lvlText w:val="■"/>
+      <w:lvlJc w:val="left"/>
+      <w:pPr>
+        <w:ind w:left="4320" w:hanging="360"/>
+      </w:pPr>
+    </w:lvl>
+    <w:lvl w:ilvl="6" w:tplc="F9165962" w:tentative="1">
+      <w:start w:val="1"/>
+      <w:numFmt w:val="bullet"/>
+      <w:lvlText w:val="●"/>
+      <w:lvlJc w:val="left"/>
+      <w:pPr>
+        <w:ind w:left="5040" w:hanging="360"/>
+      </w:pPr>
+    </w:lvl>
+    <w:lvl w:ilvl="7" w:tplc="77764644" w:tentative="1">
+      <w:start w:val="1"/>
+      <w:numFmt w:val="bullet"/>
+      <w:lvlText w:val="●"/>
+      <w:lvlJc w:val="left"/>
+      <w:pPr>
+        <w:ind w:left="5760" w:hanging="360"/>
+      </w:pPr>
+    </w:lvl>
+    <w:lvl w:ilvl="8" w:tplc="2FC4EA78" w:tentative="1">
+      <w:start w:val="1"/>
+      <w:numFmt w:val="bullet"/>
+      <w:lvlText w:val="●"/>
+      <w:lvlJc w:val="left"/>
+      <w:pPr>
+        <w:ind w:left="6480" w:hanging="360"/>
+      </w:pPr>
+    </w:lvl>
+  </w:abstractNum>
+  <w:num w:numId="1" w16cid:durableId="1263800848">
+    <w:abstractNumId w:val="1"/>
     <w:lvlOverride w:ilvl="0">
       <w:startOverride w:val="1"/>
     </w:lvlOverride>
   </w:num>
-  <w:num w:numId="2" w16cid:durableId="2124834990">
-    <w:abstractNumId w:val="1"/>
+  <w:num w:numId="2" w16cid:durableId="1352143437">
+    <w:abstractNumId w:val="0"/>
     <w:lvlOverride w:ilvl="0">
       <w:startOverride w:val="1"/>
     </w:lvlOverride>

</xml_diff>